<commit_message>
feat: reforcar dados reais e entrega final HoloPass
</commit_message>
<xml_diff>
--- a/software-total-experience/Software_TXD_HoloPass.docx
+++ b/software-total-experience/Software_TXD_HoloPass.docx
@@ -304,7 +304,7 @@
                 <w:color w:val="000000"/>
                 <w:sz w:val="21"/>
               </w:rPr>
-              <w:t>Recursos visuais antigos e promessas tecnicas sem evidencia foram removidos da entrega principal. O projeto agora foca em HoloRoute deterministico, design fisico viavel, GNSS, NFC, PWA offline e mapa de calor conceitual.</w:t>
+              <w:t>A entrega revisada foca em produto viavel: design fisico restaurado, NFC, GNSS, PWA offline, HoloRoute deterministico, proximo trem real quando a API cobre a estacao e cobertura urbana com OpenStreetMap/Overpass e GTFS SPTrans.</w:t>
             </w:r>
           </w:p>
         </w:tc>
@@ -418,7 +418,7 @@
           <w:color w:val="000000"/>
           <w:sz w:val="22"/>
         </w:rPr>
-        <w:t>O HoloPass propoe uma pulseira com display, NFC, vibracao e leitura GNSS. O app demonstra autenticacao, saldo, recarga, historico, rotas, pagamento, modo offline, HoloRoute deterministico e mapa de calor conceitual de areas mal atendidas.</w:t>
+        <w:t>O HoloPass propoe uma pulseira com display, NFC, vibracao e leitura GNSS. O app demonstra autenticacao, saldo, recarga, historico, rotas, pagamento, modo offline, HoloRoute deterministico, proximo trem real quando disponivel e analise de areas mal atendidas.</w:t>
       </w:r>
     </w:p>
     <w:p>
@@ -512,7 +512,7 @@
           <w:color w:val="000000"/>
           <w:sz w:val="22"/>
         </w:rPr>
-        <w:t>A conexao espacial e direta por GNSS: o sistema usa latitude/longitude, precisao em metros e Haversine para identificar a estacao mais proxima. A camada de Observacao da Terra usa CBERS-4A/Amazonia-1 como referencia conceitual para planejamento urbano, sempre rotulada como demonstrativa e sem inventar dado satelital real.</w:t>
+        <w:t>A conexao espacial e direta por GNSS: o sistema usa latitude/longitude, precisao em metros e Haversine para identificar a estacao mais proxima. A camada de cobertura urbana usa OpenStreetMap/Overpass para localizar estacoes reais e GTFS SPTrans para contar paradas de onibus no raio consultado dentro da cobertura municipal de Sao Paulo. CBERS-4A/Amazonia-1 entram como contexto de Observacao da Terra, sem inventar imagem satelital real.</w:t>
       </w:r>
     </w:p>
     <w:p>
@@ -858,7 +858,7 @@
                 <w:color w:val="000000"/>
                 <w:sz w:val="18"/>
               </w:rPr>
-              <w:t>Simula a pulseira fisica com GNSS, NFC, LED, buzzer e telemetria</w:t>
+              <w:t>Simula a pulseira fisica com GNSS, NFC, botoes, LEDs, buzzer, demanda urbana e telemetria</w:t>
             </w:r>
           </w:p>
         </w:tc>
@@ -1068,7 +1068,7 @@
           <w:color w:val="000000"/>
           <w:sz w:val="21"/>
         </w:rPr>
-        <w:t>A pulseira fisica pode ser prototipada com ESP32/Arduino, RFID/NFC, display OLED, motor de vibracao e bateria.</w:t>
+        <w:t>A pulseira fisica pode ser prototipada com ESP32/Arduino, RFID/NFC, display OLED, motor de vibracao, LEDs de estado, botoes e bateria.</w:t>
       </w:r>
     </w:p>
     <w:p>
@@ -1110,7 +1110,21 @@
           <w:color w:val="000000"/>
           <w:sz w:val="21"/>
         </w:rPr>
-        <w:t>Proximo trem e lotacao sao estimativas locais, nao API oficial de operacao.</w:t>
+        <w:t>Proximo trem usa a API publica ViaMobilidade nas estacoes cobertas; fora disso, o app mostra fallback honesto.</w:t>
+      </w:r>
+    </w:p>
+    <w:p>
+      <w:pPr>
+        <w:pStyle w:val="ListBullet"/>
+        <w:spacing w:after="80" w:line="264" w:lineRule="auto"/>
+      </w:pPr>
+      <w:r>
+        <w:rPr>
+          <w:rFonts w:ascii="Calibri" w:hAnsi="Calibri"/>
+          <w:color w:val="000000"/>
+          <w:sz w:val="21"/>
+        </w:rPr>
+        <w:t>A priorizacao urbana consulta Overpass/OpenStreetMap, usa GTFS SPTrans local e calcula distancia por Haversine.</w:t>
       </w:r>
     </w:p>
     <w:p>
@@ -2186,7 +2200,7 @@
                 <w:color w:val="000000"/>
                 <w:sz w:val="18"/>
               </w:rPr>
-              <w:t>Hotspots mostram diagnostico e prioridade.</w:t>
+              <w:t>GNSS/OSM mostram estacao proxima, distancia e prioridade.</w:t>
             </w:r>
           </w:p>
         </w:tc>
@@ -2264,7 +2278,7 @@
                 <w:color w:val="000000"/>
                 <w:sz w:val="18"/>
               </w:rPr>
-              <w:t>Painel mostra risco, lotacao e recomendacao sem prometer API real.</w:t>
+              <w:t>Painel mostra risco, lotacao e recomendacao deterministica.</w:t>
             </w:r>
           </w:p>
         </w:tc>

</xml_diff>

<commit_message>
feat: substituir design antigo por painel operacional
</commit_message>
<xml_diff>
--- a/software-total-experience/Software_TXD_HoloPass.docx
+++ b/software-total-experience/Software_TXD_HoloPass.docx
@@ -304,7 +304,7 @@
                 <w:color w:val="000000"/>
                 <w:sz w:val="21"/>
               </w:rPr>
-              <w:t>A entrega revisada foca em produto viavel: design fisico restaurado, NFC, GNSS, PWA offline, HoloRoute deterministico, proximo trem real quando a API cobre a estacao e cobertura urbana com OpenStreetMap/Overpass e GTFS SPTrans.</w:t>
+              <w:t>A entrega revisada foca em produto viavel: diagnostico GNSS real pelo navegador, catraca NFC simulada, PWA offline, HoloRoute deterministico, proximo trem real quando a API cobre a estacao e cobertura urbana com OpenStreetMap/Overpass e GTFS SPTrans.</w:t>
             </w:r>
           </w:p>
         </w:tc>
@@ -436,55 +436,15 @@
     </w:p>
     <w:p>
       <w:pPr>
-        <w:jc w:val="center"/>
-      </w:pPr>
-      <w:r>
-        <w:drawing>
-          <wp:inline xmlns:a="http://schemas.openxmlformats.org/drawingml/2006/main" xmlns:pic="http://schemas.openxmlformats.org/drawingml/2006/picture">
-            <wp:extent cx="5212080" cy="5687707"/>
-            <wp:docPr id="1" name="Picture 1"/>
-            <wp:cNvGraphicFramePr>
-              <a:graphicFrameLocks noChangeAspect="1"/>
-            </wp:cNvGraphicFramePr>
-            <a:graphic>
-              <a:graphicData uri="http://schemas.openxmlformats.org/drawingml/2006/picture">
-                <pic:pic>
-                  <pic:nvPicPr>
-                    <pic:cNvPr id="0" name="holopass-band-redesign-preview.png"/>
-                    <pic:cNvPicPr/>
-                  </pic:nvPicPr>
-                  <pic:blipFill>
-                    <a:blip r:embed="rId11"/>
-                    <a:stretch>
-                      <a:fillRect/>
-                    </a:stretch>
-                  </pic:blipFill>
-                  <pic:spPr>
-                    <a:xfrm>
-                      <a:off x="0" y="0"/>
-                      <a:ext cx="5212080" cy="5687707"/>
-                    </a:xfrm>
-                    <a:prstGeom prst="rect"/>
-                  </pic:spPr>
-                </pic:pic>
-              </a:graphicData>
-            </a:graphic>
-          </wp:inline>
-        </w:drawing>
-      </w:r>
-    </w:p>
-    <w:p>
-      <w:pPr>
-        <w:jc w:val="center"/>
+        <w:spacing w:after="120" w:line="264" w:lineRule="auto"/>
       </w:pPr>
       <w:r>
         <w:rPr>
           <w:rFonts w:ascii="Calibri" w:hAnsi="Calibri"/>
-          <w:i/>
-          <w:color w:val="5B6770"/>
-          <w:sz w:val="18"/>
+          <w:color w:val="000000"/>
+          <w:sz w:val="22"/>
         </w:rPr>
-        <w:t>Referencia visual local do design fisico da pulseira HoloPass.</w:t>
+        <w:t>No site principal, a antiga vitrine visual foi substituida por um painel operacional com diagnostico GNSS, validacao NFC simulada e metricas de viagem. Isso reforca funcionamento verificavel em vez de uma imagem estatica do produto.</w:t>
       </w:r>
     </w:p>
     <w:p>

</xml_diff>

<commit_message>
docs: embutir user flow no software txd
</commit_message>
<xml_diff>
--- a/software-total-experience/Software_TXD_HoloPass.docx
+++ b/software-total-experience/Software_TXD_HoloPass.docx
@@ -2338,6 +2338,72 @@
         <w:t>10. User Flow</w:t>
       </w:r>
     </w:p>
+    <w:p>
+      <w:pPr>
+        <w:spacing w:after="120" w:line="264" w:lineRule="auto"/>
+      </w:pPr>
+      <w:r>
+        <w:rPr>
+          <w:rFonts w:ascii="Calibri" w:hAnsi="Calibri"/>
+          <w:color w:val="000000"/>
+          <w:sz w:val="22"/>
+        </w:rPr>
+        <w:t>O fluxo usa pecas fundamentais de fluxograma: terminal para inicio/fim, retangulo para processo, losango para decisao, paralelogramo para entrada/saida e cilindro para dados persistidos.</w:t>
+      </w:r>
+    </w:p>
+    <w:p>
+      <w:pPr>
+        <w:jc w:val="center"/>
+      </w:pPr>
+      <w:r>
+        <w:drawing>
+          <wp:inline xmlns:a="http://schemas.openxmlformats.org/drawingml/2006/main" xmlns:pic="http://schemas.openxmlformats.org/drawingml/2006/picture">
+            <wp:extent cx="5715000" cy="6735536"/>
+            <wp:docPr id="1" name="Picture 1"/>
+            <wp:cNvGraphicFramePr>
+              <a:graphicFrameLocks noChangeAspect="1"/>
+            </wp:cNvGraphicFramePr>
+            <a:graphic>
+              <a:graphicData uri="http://schemas.openxmlformats.org/drawingml/2006/picture">
+                <pic:pic>
+                  <pic:nvPicPr>
+                    <pic:cNvPr id="0" name="user_flow_holopass.png"/>
+                    <pic:cNvPicPr/>
+                  </pic:nvPicPr>
+                  <pic:blipFill>
+                    <a:blip r:embed="rId11"/>
+                    <a:stretch>
+                      <a:fillRect/>
+                    </a:stretch>
+                  </pic:blipFill>
+                  <pic:spPr>
+                    <a:xfrm>
+                      <a:off x="0" y="0"/>
+                      <a:ext cx="5715000" cy="6735536"/>
+                    </a:xfrm>
+                    <a:prstGeom prst="rect"/>
+                  </pic:spPr>
+                </pic:pic>
+              </a:graphicData>
+            </a:graphic>
+          </wp:inline>
+        </w:drawing>
+      </w:r>
+    </w:p>
+    <w:p>
+      <w:pPr>
+        <w:jc w:val="center"/>
+      </w:pPr>
+      <w:r>
+        <w:rPr>
+          <w:rFonts w:ascii="Calibri" w:hAnsi="Calibri"/>
+          <w:i/>
+          <w:color w:val="5B6770"/>
+          <w:sz w:val="18"/>
+        </w:rPr>
+        <w:t>Fluxograma do User Flow com simbolos padrao de processo, decisao, entrada/saida e dados.</w:t>
+      </w:r>
+    </w:p>
     <w:tbl>
       <w:tblPr>
         <w:tblStyle w:val="TableGrid"/>
@@ -2349,8 +2415,8 @@
       </w:tblPr>
       <w:tblGrid>
         <w:gridCol w:w="900"/>
-        <w:gridCol w:w="3600"/>
-        <w:gridCol w:w="4860"/>
+        <w:gridCol w:w="1500"/>
+        <w:gridCol w:w="6960"/>
       </w:tblGrid>
       <w:tr>
         <w:tc>
@@ -2382,7 +2448,7 @@
         </w:tc>
         <w:tc>
           <w:tcPr>
-            <w:tcW w:type="dxa" w:w="3600"/>
+            <w:tcW w:type="dxa" w:w="1500"/>
             <w:tcMar>
               <w:top w:w="80" w:type="dxa"/>
               <w:bottom w:w="80" w:type="dxa"/>
@@ -2403,13 +2469,13 @@
                 <w:color w:val="1F4D78"/>
                 <w:sz w:val="19"/>
               </w:rPr>
-              <w:t>Acao do usuario</w:t>
+              <w:t>Peca</w:t>
             </w:r>
           </w:p>
         </w:tc>
         <w:tc>
           <w:tcPr>
-            <w:tcW w:type="dxa" w:w="4860"/>
+            <w:tcW w:type="dxa" w:w="6960"/>
             <w:tcMar>
               <w:top w:w="80" w:type="dxa"/>
               <w:bottom w:w="80" w:type="dxa"/>
@@ -2430,7 +2496,7 @@
                 <w:color w:val="1F4D78"/>
                 <w:sz w:val="19"/>
               </w:rPr>
-              <w:t>Resposta do sistema</w:t>
+              <w:t>Acao do usuario/sistema</w:t>
             </w:r>
           </w:p>
         </w:tc>
@@ -2457,7 +2523,7 @@
         </w:tc>
         <w:tc>
           <w:tcPr>
-            <w:tcW w:type="dxa" w:w="3600"/>
+            <w:tcW w:type="dxa" w:w="1500"/>
           </w:tcPr>
           <w:p>
             <w:pPr>
@@ -2470,13 +2536,13 @@
                 <w:color w:val="000000"/>
                 <w:sz w:val="18"/>
               </w:rPr>
-              <w:t>Abre o HoloPass</w:t>
+              <w:t>Terminal</w:t>
             </w:r>
           </w:p>
         </w:tc>
         <w:tc>
           <w:tcPr>
-            <w:tcW w:type="dxa" w:w="4860"/>
+            <w:tcW w:type="dxa" w:w="6960"/>
           </w:tcPr>
           <w:p>
             <w:pPr>
@@ -2489,7 +2555,7 @@
                 <w:color w:val="000000"/>
                 <w:sz w:val="18"/>
               </w:rPr>
-              <w:t>Restaura sessao ou mostra login/cadastro/demo.</w:t>
+              <w:t>Passageiro abre o HoloPass.</w:t>
             </w:r>
           </w:p>
         </w:tc>
@@ -2516,7 +2582,7 @@
         </w:tc>
         <w:tc>
           <w:tcPr>
-            <w:tcW w:type="dxa" w:w="3600"/>
+            <w:tcW w:type="dxa" w:w="1500"/>
           </w:tcPr>
           <w:p>
             <w:pPr>
@@ -2529,13 +2595,13 @@
                 <w:color w:val="000000"/>
                 <w:sz w:val="18"/>
               </w:rPr>
-              <w:t>Consulta saldo</w:t>
+              <w:t>Decisao</w:t>
             </w:r>
           </w:p>
         </w:tc>
         <w:tc>
           <w:tcPr>
-            <w:tcW w:type="dxa" w:w="4860"/>
+            <w:tcW w:type="dxa" w:w="6960"/>
           </w:tcPr>
           <w:p>
             <w:pPr>
@@ -2548,7 +2614,7 @@
                 <w:color w:val="000000"/>
                 <w:sz w:val="18"/>
               </w:rPr>
-              <w:t>Mostra saldo, historico e estatisticas.</w:t>
+              <w:t>Sistema verifica se existe sessao ativa.</w:t>
             </w:r>
           </w:p>
         </w:tc>
@@ -2575,7 +2641,7 @@
         </w:tc>
         <w:tc>
           <w:tcPr>
-            <w:tcW w:type="dxa" w:w="3600"/>
+            <w:tcW w:type="dxa" w:w="1500"/>
           </w:tcPr>
           <w:p>
             <w:pPr>
@@ -2588,13 +2654,13 @@
                 <w:color w:val="000000"/>
                 <w:sz w:val="18"/>
               </w:rPr>
-              <w:t>Recarrega se necessario</w:t>
+              <w:t>Processo</w:t>
             </w:r>
           </w:p>
         </w:tc>
         <w:tc>
           <w:tcPr>
-            <w:tcW w:type="dxa" w:w="4860"/>
+            <w:tcW w:type="dxa" w:w="6960"/>
           </w:tcPr>
           <w:p>
             <w:pPr>
@@ -2607,7 +2673,7 @@
                 <w:color w:val="000000"/>
                 <w:sz w:val="18"/>
               </w:rPr>
-              <w:t>Atualiza saldo por PIX/cartao/debito simulado.</w:t>
+              <w:t>Usuario faz login, cadastro ou entra no modo demo.</w:t>
             </w:r>
           </w:p>
         </w:tc>
@@ -2634,7 +2700,7 @@
         </w:tc>
         <w:tc>
           <w:tcPr>
-            <w:tcW w:type="dxa" w:w="3600"/>
+            <w:tcW w:type="dxa" w:w="1500"/>
           </w:tcPr>
           <w:p>
             <w:pPr>
@@ -2647,13 +2713,13 @@
                 <w:color w:val="000000"/>
                 <w:sz w:val="18"/>
               </w:rPr>
-              <w:t>Detecta origem por GNSS ou seleciona manualmente</w:t>
+              <w:t>Dados</w:t>
             </w:r>
           </w:p>
         </w:tc>
         <w:tc>
           <w:tcPr>
-            <w:tcW w:type="dxa" w:w="4860"/>
+            <w:tcW w:type="dxa" w:w="6960"/>
           </w:tcPr>
           <w:p>
             <w:pPr>
@@ -2666,7 +2732,7 @@
                 <w:color w:val="000000"/>
                 <w:sz w:val="18"/>
               </w:rPr>
-              <w:t>Mostra estacao mais proxima e precisao.</w:t>
+              <w:t>Sistema carrega saldo, historico e cache local.</w:t>
             </w:r>
           </w:p>
         </w:tc>
@@ -2693,7 +2759,7 @@
         </w:tc>
         <w:tc>
           <w:tcPr>
-            <w:tcW w:type="dxa" w:w="3600"/>
+            <w:tcW w:type="dxa" w:w="1500"/>
           </w:tcPr>
           <w:p>
             <w:pPr>
@@ -2706,13 +2772,13 @@
                 <w:color w:val="000000"/>
                 <w:sz w:val="18"/>
               </w:rPr>
-              <w:t>Escolhe destino</w:t>
+              <w:t>Decisao</w:t>
             </w:r>
           </w:p>
         </w:tc>
         <w:tc>
           <w:tcPr>
-            <w:tcW w:type="dxa" w:w="4860"/>
+            <w:tcW w:type="dxa" w:w="6960"/>
           </w:tcPr>
           <w:p>
             <w:pPr>
@@ -2725,7 +2791,7 @@
                 <w:color w:val="000000"/>
                 <w:sz w:val="18"/>
               </w:rPr>
-              <w:t>HoloRoute calcula grafo de linhas e baldeacoes.</w:t>
+              <w:t>Sistema verifica se o saldo cobre a tarifa de R$ 5,40.</w:t>
             </w:r>
           </w:p>
         </w:tc>
@@ -2752,7 +2818,7 @@
         </w:tc>
         <w:tc>
           <w:tcPr>
-            <w:tcW w:type="dxa" w:w="3600"/>
+            <w:tcW w:type="dxa" w:w="1500"/>
           </w:tcPr>
           <w:p>
             <w:pPr>
@@ -2765,13 +2831,13 @@
                 <w:color w:val="000000"/>
                 <w:sz w:val="18"/>
               </w:rPr>
-              <w:t>Confere rota</w:t>
+              <w:t>Processo</w:t>
             </w:r>
           </w:p>
         </w:tc>
         <w:tc>
           <w:tcPr>
-            <w:tcW w:type="dxa" w:w="4860"/>
+            <w:tcW w:type="dxa" w:w="6960"/>
           </w:tcPr>
           <w:p>
             <w:pPr>
@@ -2784,7 +2850,7 @@
                 <w:color w:val="000000"/>
                 <w:sz w:val="18"/>
               </w:rPr>
-              <w:t>Mostra distancia operacional, tempo, tarifa, paradas e timeline.</w:t>
+              <w:t>Se necessario, usuario recarrega por PIX, cartao ou debito.</w:t>
             </w:r>
           </w:p>
         </w:tc>
@@ -2811,7 +2877,7 @@
         </w:tc>
         <w:tc>
           <w:tcPr>
-            <w:tcW w:type="dxa" w:w="3600"/>
+            <w:tcW w:type="dxa" w:w="1500"/>
           </w:tcPr>
           <w:p>
             <w:pPr>
@@ -2824,13 +2890,13 @@
                 <w:color w:val="000000"/>
                 <w:sz w:val="18"/>
               </w:rPr>
-              <w:t>Aproxima NFC</w:t>
+              <w:t>Entrada/Saida</w:t>
             </w:r>
           </w:p>
         </w:tc>
         <w:tc>
           <w:tcPr>
-            <w:tcW w:type="dxa" w:w="4860"/>
+            <w:tcW w:type="dxa" w:w="6960"/>
           </w:tcPr>
           <w:p>
             <w:pPr>
@@ -2843,7 +2909,7 @@
                 <w:color w:val="000000"/>
                 <w:sz w:val="18"/>
               </w:rPr>
-              <w:t>Debita saldo ou orienta recarga se insuficiente.</w:t>
+              <w:t>Usuario informa origem por GNSS/manual e seleciona destino.</w:t>
             </w:r>
           </w:p>
         </w:tc>
@@ -2870,7 +2936,7 @@
         </w:tc>
         <w:tc>
           <w:tcPr>
-            <w:tcW w:type="dxa" w:w="3600"/>
+            <w:tcW w:type="dxa" w:w="1500"/>
           </w:tcPr>
           <w:p>
             <w:pPr>
@@ -2883,13 +2949,13 @@
                 <w:color w:val="000000"/>
                 <w:sz w:val="18"/>
               </w:rPr>
-              <w:t>Viaja</w:t>
+              <w:t>Processo</w:t>
             </w:r>
           </w:p>
         </w:tc>
         <w:tc>
           <w:tcPr>
-            <w:tcW w:type="dxa" w:w="4860"/>
+            <w:tcW w:type="dxa" w:w="6960"/>
           </w:tcPr>
           <w:p>
             <w:pPr>
@@ -2902,7 +2968,184 @@
                 <w:color w:val="000000"/>
                 <w:sz w:val="18"/>
               </w:rPr>
-              <w:t>Historico e PWA mantem dados essenciais disponiveis.</w:t>
+              <w:t>HoloRoute calcula grafo, linhas, paradas e baldeacoes.</w:t>
+            </w:r>
+          </w:p>
+        </w:tc>
+      </w:tr>
+      <w:tr>
+        <w:tc>
+          <w:tcPr>
+            <w:tcW w:type="dxa" w:w="900"/>
+          </w:tcPr>
+          <w:p>
+            <w:pPr>
+              <w:spacing w:after="0" w:line="264" w:lineRule="auto"/>
+            </w:pPr>
+            <w:r>
+              <w:rPr>
+                <w:rFonts w:ascii="Calibri" w:hAnsi="Calibri"/>
+                <w:b w:val="0"/>
+                <w:color w:val="000000"/>
+                <w:sz w:val="18"/>
+              </w:rPr>
+              <w:t>9</w:t>
+            </w:r>
+          </w:p>
+        </w:tc>
+        <w:tc>
+          <w:tcPr>
+            <w:tcW w:type="dxa" w:w="1500"/>
+          </w:tcPr>
+          <w:p>
+            <w:pPr>
+              <w:spacing w:after="0" w:line="264" w:lineRule="auto"/>
+            </w:pPr>
+            <w:r>
+              <w:rPr>
+                <w:rFonts w:ascii="Calibri" w:hAnsi="Calibri"/>
+                <w:b w:val="0"/>
+                <w:color w:val="000000"/>
+                <w:sz w:val="18"/>
+              </w:rPr>
+              <w:t>Entrada/Saida</w:t>
+            </w:r>
+          </w:p>
+        </w:tc>
+        <w:tc>
+          <w:tcPr>
+            <w:tcW w:type="dxa" w:w="6960"/>
+          </w:tcPr>
+          <w:p>
+            <w:pPr>
+              <w:spacing w:after="0" w:line="264" w:lineRule="auto"/>
+            </w:pPr>
+            <w:r>
+              <w:rPr>
+                <w:rFonts w:ascii="Calibri" w:hAnsi="Calibri"/>
+                <w:b w:val="0"/>
+                <w:color w:val="000000"/>
+                <w:sz w:val="18"/>
+              </w:rPr>
+              <w:t>App exibe rota visual, tempo, tarifa e recomendacao.</w:t>
+            </w:r>
+          </w:p>
+        </w:tc>
+      </w:tr>
+      <w:tr>
+        <w:tc>
+          <w:tcPr>
+            <w:tcW w:type="dxa" w:w="900"/>
+          </w:tcPr>
+          <w:p>
+            <w:pPr>
+              <w:spacing w:after="0" w:line="264" w:lineRule="auto"/>
+            </w:pPr>
+            <w:r>
+              <w:rPr>
+                <w:rFonts w:ascii="Calibri" w:hAnsi="Calibri"/>
+                <w:b w:val="0"/>
+                <w:color w:val="000000"/>
+                <w:sz w:val="18"/>
+              </w:rPr>
+              <w:t>10</w:t>
+            </w:r>
+          </w:p>
+        </w:tc>
+        <w:tc>
+          <w:tcPr>
+            <w:tcW w:type="dxa" w:w="1500"/>
+          </w:tcPr>
+          <w:p>
+            <w:pPr>
+              <w:spacing w:after="0" w:line="264" w:lineRule="auto"/>
+            </w:pPr>
+            <w:r>
+              <w:rPr>
+                <w:rFonts w:ascii="Calibri" w:hAnsi="Calibri"/>
+                <w:b w:val="0"/>
+                <w:color w:val="000000"/>
+                <w:sz w:val="18"/>
+              </w:rPr>
+              <w:t>Processo</w:t>
+            </w:r>
+          </w:p>
+        </w:tc>
+        <w:tc>
+          <w:tcPr>
+            <w:tcW w:type="dxa" w:w="6960"/>
+          </w:tcPr>
+          <w:p>
+            <w:pPr>
+              <w:spacing w:after="0" w:line="264" w:lineRule="auto"/>
+            </w:pPr>
+            <w:r>
+              <w:rPr>
+                <w:rFonts w:ascii="Calibri" w:hAnsi="Calibri"/>
+                <w:b w:val="0"/>
+                <w:color w:val="000000"/>
+                <w:sz w:val="18"/>
+              </w:rPr>
+              <w:t>Usuario aproxima NFC; sistema debita ou bloqueia por saldo insuficiente.</w:t>
+            </w:r>
+          </w:p>
+        </w:tc>
+      </w:tr>
+      <w:tr>
+        <w:tc>
+          <w:tcPr>
+            <w:tcW w:type="dxa" w:w="900"/>
+          </w:tcPr>
+          <w:p>
+            <w:pPr>
+              <w:spacing w:after="0" w:line="264" w:lineRule="auto"/>
+            </w:pPr>
+            <w:r>
+              <w:rPr>
+                <w:rFonts w:ascii="Calibri" w:hAnsi="Calibri"/>
+                <w:b w:val="0"/>
+                <w:color w:val="000000"/>
+                <w:sz w:val="18"/>
+              </w:rPr>
+              <w:t>11</w:t>
+            </w:r>
+          </w:p>
+        </w:tc>
+        <w:tc>
+          <w:tcPr>
+            <w:tcW w:type="dxa" w:w="1500"/>
+          </w:tcPr>
+          <w:p>
+            <w:pPr>
+              <w:spacing w:after="0" w:line="264" w:lineRule="auto"/>
+            </w:pPr>
+            <w:r>
+              <w:rPr>
+                <w:rFonts w:ascii="Calibri" w:hAnsi="Calibri"/>
+                <w:b w:val="0"/>
+                <w:color w:val="000000"/>
+                <w:sz w:val="18"/>
+              </w:rPr>
+              <w:t>Dados/Terminal</w:t>
+            </w:r>
+          </w:p>
+        </w:tc>
+        <w:tc>
+          <w:tcPr>
+            <w:tcW w:type="dxa" w:w="6960"/>
+          </w:tcPr>
+          <w:p>
+            <w:pPr>
+              <w:spacing w:after="0" w:line="264" w:lineRule="auto"/>
+            </w:pPr>
+            <w:r>
+              <w:rPr>
+                <w:rFonts w:ascii="Calibri" w:hAnsi="Calibri"/>
+                <w:b w:val="0"/>
+                <w:color w:val="000000"/>
+                <w:sz w:val="18"/>
+              </w:rPr>
+              <w:t>Historico e PWA sao atualizados; embarque fica registrado.</w:t>
             </w:r>
           </w:p>
         </w:tc>

</xml_diff>

<commit_message>
docs: corrigir pontuacao do software txd
</commit_message>
<xml_diff>
--- a/software-total-experience/Software_TXD_HoloPass.docx
+++ b/software-total-experience/Software_TXD_HoloPass.docx
@@ -27,7 +27,7 @@
           <w:color w:val="5B6770"/>
           <w:sz w:val="26"/>
         </w:rPr>
-        <w:t>Software &amp; Total Experience Design | Global Solution 2026 | Industria Espacial</w:t>
+        <w:t>Software &amp; Total Experience Design | Global Solution 2026 | Indústria Espacial</w:t>
       </w:r>
     </w:p>
     <w:tbl>
@@ -94,7 +94,7 @@
                 <w:color w:val="1F4D78"/>
                 <w:sz w:val="19"/>
               </w:rPr>
-              <w:t>Informacao</w:t>
+              <w:t>Informação</w:t>
             </w:r>
           </w:p>
         </w:tc>
@@ -296,7 +296,7 @@
                 <w:color w:val="1F4D78"/>
                 <w:sz w:val="21"/>
               </w:rPr>
-              <w:t xml:space="preserve">Decisao de revisao: </w:t>
+              <w:t xml:space="preserve">Decisão de revisão: </w:t>
             </w:r>
             <w:r>
               <w:rPr>
@@ -304,7 +304,7 @@
                 <w:color w:val="000000"/>
                 <w:sz w:val="21"/>
               </w:rPr>
-              <w:t>A entrega revisada foca em produto viavel: diagnostico GNSS real pelo navegador, catraca NFC simulada, PWA offline, HoloRoute deterministico, proximo trem real quando a API cobre a estacao e cobertura urbana com OpenStreetMap/Overpass e GTFS SPTrans.</w:t>
+              <w:t>A entrega revisada foca em um produto viável: diagnóstico GNSS real pelo navegador, catraca NFC simulada, PWA offline, HoloRoute determinístico, próximo trem real quando a API cobre a estação e cobertura urbana com OpenStreetMap/Overpass e GTFS SPTrans.</w:t>
             </w:r>
           </w:p>
         </w:tc>
@@ -323,7 +323,7 @@
           <w:color w:val="2E74B5"/>
           <w:sz w:val="32"/>
         </w:rPr>
-        <w:t>1. Sumario Executivo</w:t>
+        <w:t>1. Sumário Executivo</w:t>
       </w:r>
     </w:p>
     <w:p>
@@ -336,7 +336,7 @@
           <w:color w:val="000000"/>
           <w:sz w:val="22"/>
         </w:rPr>
-        <w:t>O HoloPass e uma pulseira inteligente para transporte publico urbano. Ela une pagamento por NFC, localizacao por GNSS, planejamento de rota operacional e PWA offline para reduzir filas, inseguranca, dependencia do celular e falta de informacao durante deslocamentos.</w:t>
+        <w:t>O HoloPass é uma pulseira inteligente para transporte público urbano. Ela une pagamento por NFC, localização por GNSS, planejamento de rota operacional e PWA offline para reduzir filas, insegurança, dependência do celular e falta de informação durante deslocamentos.</w:t>
       </w:r>
     </w:p>
     <w:p>
@@ -349,7 +349,7 @@
           <w:color w:val="000000"/>
           <w:sz w:val="22"/>
         </w:rPr>
-        <w:t>O projeto existe como sistema integrado: app web em HTML/CSS/JS puro, landing page, firmware Arduino, programa Python de menu, modelo matematico GNSS e documentacao de pitch. Cada disciplina entrega uma camada da mesma solucao.</w:t>
+        <w:t>O projeto existe como sistema integrado: app web em HTML/CSS/JS puro, landing page, firmware Arduino, programa Python de menu, modelo matemático GNSS e documentação de pitch. Cada disciplina entrega uma camada da mesma solução.</w:t>
       </w:r>
     </w:p>
     <w:p>
@@ -377,7 +377,7 @@
           <w:color w:val="000000"/>
           <w:sz w:val="22"/>
         </w:rPr>
-        <w:t>Passageiros enfrentam catracas lentas, saldo pouco visivel, celulares expostos em estacoes lotadas e informacao limitada sobre rota, baldeacao e chegada. Pessoas com menor acesso a smartphone/dados moveis sofrem mais, ampliando desigualdade de mobilidade.</w:t>
+        <w:t>Passageiros enfrentam catracas lentas, saldo pouco visível, celulares expostos em estações lotadas e informação limitada sobre rota, baldeação e chegada. Pessoas com menor acesso a smartphone/dados móveis sofrem mais, ampliando desigualdade de mobilidade.</w:t>
       </w:r>
     </w:p>
     <w:p>
@@ -390,7 +390,7 @@
           <w:color w:val="000000"/>
           <w:sz w:val="22"/>
         </w:rPr>
-        <w:t>O custo aparece em tempo perdido, risco de furto, atraso operacional e menor confianca no transporte publico. A solucao importa porque mobilidade previsivel melhora acesso a estudo, trabalho, saude e lazer.</w:t>
+        <w:t>O custo aparece em tempo perdido, risco de furto, atraso operacional e menor confiança no transporte público. A solução importa porque mobilidade previsível melhora acesso a estudo, trabalho, saúde e lazer.</w:t>
       </w:r>
     </w:p>
     <w:p>
@@ -405,7 +405,7 @@
           <w:color w:val="2E74B5"/>
           <w:sz w:val="32"/>
         </w:rPr>
-        <w:t>3. Solucao Tecnologica</w:t>
+        <w:t>3. Solução Tecnológica</w:t>
       </w:r>
     </w:p>
     <w:p>
@@ -418,7 +418,7 @@
           <w:color w:val="000000"/>
           <w:sz w:val="22"/>
         </w:rPr>
-        <w:t>O HoloPass propoe uma pulseira com display, NFC, vibracao e leitura GNSS. O app demonstra autenticacao, saldo, recarga, historico, rotas, pagamento, modo offline, HoloRoute deterministico, proximo trem real quando disponivel e analise de areas mal atendidas.</w:t>
+        <w:t>O HoloPass propõe uma pulseira com display, NFC, vibração e leitura GNSS. O app demonstra autenticação, saldo, recarga, histórico, rotas, pagamento, modo offline, HoloRoute determinístico, próximo trem real quando disponível e análise de áreas mal atendidas.</w:t>
       </w:r>
     </w:p>
     <w:p>
@@ -431,7 +431,7 @@
           <w:color w:val="000000"/>
           <w:sz w:val="22"/>
         </w:rPr>
-        <w:t>O HoloRoute monta a malha como grafo de estacoes, linhas e corredores de transferencia. No caso Osasco -&gt; Trianon-MASP, a rota correta usa Linha 9, transferencia em Pinheiros para Linha 4, transferencia Paulista/Consolacao para Linha 2 e chegada em Trianon-MASP.</w:t>
+        <w:t>O HoloRoute monta a malha como grafo de estações, linhas e corredores de transferência. No caso Osasco -&gt; Trianon-MASP, a rota correta usa Linha 9, transferência em Pinheiros para Linha 4, transferência Paulista/Consolação para Linha 2 e chegada em Trianon-MASP.</w:t>
       </w:r>
     </w:p>
     <w:p>
@@ -444,7 +444,7 @@
           <w:color w:val="000000"/>
           <w:sz w:val="22"/>
         </w:rPr>
-        <w:t>No site principal, a antiga vitrine visual foi substituida por um painel operacional com diagnostico GNSS, validacao NFC simulada e metricas de viagem. Isso reforca funcionamento verificavel em vez de uma imagem estatica do produto.</w:t>
+        <w:t>No site principal, a antiga vitrine visual foi substituída por um painel operacional com diagnóstico GNSS, validação NFC simulada e métricas de viagem. Isso reforça funcionamento verificável em vez de uma imagem estática do produto.</w:t>
       </w:r>
     </w:p>
     <w:p>
@@ -459,7 +459,7 @@
           <w:color w:val="2E74B5"/>
           <w:sz w:val="32"/>
         </w:rPr>
-        <w:t>4. Conexao com a Industria Espacial</w:t>
+        <w:t>4. Conexão com a Indústria Espacial</w:t>
       </w:r>
     </w:p>
     <w:p>
@@ -472,7 +472,7 @@
           <w:color w:val="000000"/>
           <w:sz w:val="22"/>
         </w:rPr>
-        <w:t>A conexao espacial e direta por GNSS: o sistema usa latitude/longitude, precisao em metros e Haversine para identificar a estacao mais proxima. A camada de cobertura urbana usa OpenStreetMap/Overpass para localizar estacoes reais e GTFS SPTrans para contar paradas de onibus no raio consultado dentro da cobertura municipal de Sao Paulo. CBERS-4A/Amazonia-1 entram como contexto de Observacao da Terra, sem inventar imagem satelital real.</w:t>
+        <w:t>A conexão espacial é direta por GNSS: o sistema usa latitude, longitude, precisão em metros e Haversine para identificar a estação mais próxima. A camada de cobertura urbana usa OpenStreetMap/Overpass para localizar estações reais e GTFS SPTrans para contar paradas de ônibus no raio consultado dentro da cobertura municipal de São Paulo. CBERS-4A/Amazonia-1 entram como contexto de Observação da Terra, sem inventar imagem satelital real.</w:t>
       </w:r>
     </w:p>
     <w:p>
@@ -641,7 +641,7 @@
                 <w:color w:val="000000"/>
                 <w:sz w:val="18"/>
               </w:rPr>
-              <w:t>Define problema, visao, arquitetura, backlog e fluxo</w:t>
+              <w:t>Define problema, visão, arquitetura, backlog e fluxo</w:t>
             </w:r>
           </w:p>
         </w:tc>
@@ -700,7 +700,7 @@
                 <w:color w:val="000000"/>
                 <w:sz w:val="18"/>
               </w:rPr>
-              <w:t>Comunica problema, tecnologia, objetivos, publico e beneficios</w:t>
+              <w:t>Comunica problema, tecnologia, objetivos, público e benefícios</w:t>
             </w:r>
           </w:p>
         </w:tc>
@@ -759,7 +759,7 @@
                 <w:color w:val="000000"/>
                 <w:sz w:val="18"/>
               </w:rPr>
-              <w:t>Prototipo funcional de login, recarga, rota, NFC, GNSS, quiz e feedback</w:t>
+              <w:t>Protótipo funcional de login, recarga, rota, NFC, GNSS, quiz e feedback</w:t>
             </w:r>
           </w:p>
         </w:tc>
@@ -818,7 +818,7 @@
                 <w:color w:val="000000"/>
                 <w:sz w:val="18"/>
               </w:rPr>
-              <w:t>Simula a pulseira fisica com GNSS, NFC, botoes, LEDs, buzzer, demanda urbana e telemetria</w:t>
+              <w:t>Simula a pulseira física com GNSS, NFC, botões, LEDs, buzzer, demanda urbana e telemetria</w:t>
             </w:r>
           </w:p>
         </w:tc>
@@ -877,7 +877,7 @@
                 <w:color w:val="000000"/>
                 <w:sz w:val="18"/>
               </w:rPr>
-              <w:t>Demonstra logica de usuario, saldo, rota, historico e validacao</w:t>
+              <w:t>Demonstra lógica de usuário, saldo, rota, histórico e validação</w:t>
             </w:r>
           </w:p>
         </w:tc>
@@ -936,7 +936,7 @@
                 <w:color w:val="000000"/>
                 <w:sz w:val="18"/>
               </w:rPr>
-              <w:t>Explica matematica espacial com funcoes e graficos</w:t>
+              <w:t>Explica matemática espacial com funções e gráficos</w:t>
             </w:r>
           </w:p>
         </w:tc>
@@ -1014,7 +1014,7 @@
           <w:color w:val="2E74B5"/>
           <w:sz w:val="32"/>
         </w:rPr>
-        <w:t>6. Viabilidade Tecnica</w:t>
+        <w:t>6. Viabilidade Técnica</w:t>
       </w:r>
     </w:p>
     <w:p>
@@ -1028,7 +1028,7 @@
           <w:color w:val="000000"/>
           <w:sz w:val="21"/>
         </w:rPr>
-        <w:t>A pulseira fisica pode ser prototipada com ESP32/Arduino, RFID/NFC, display OLED, motor de vibracao, LEDs de estado, botoes e bateria.</w:t>
+        <w:t>A pulseira física pode ser prototipada com ESP32/Arduino, RFID/NFC, display OLED, motor de vibração, LEDs de estado, botões e bateria.</w:t>
       </w:r>
     </w:p>
     <w:p>
@@ -1042,7 +1042,7 @@
           <w:color w:val="000000"/>
           <w:sz w:val="21"/>
         </w:rPr>
-        <w:t>GNSS e NFC no Arduino sao simulados, mas a matematica de distancia e a decisao local sao reais.</w:t>
+        <w:t>GNSS e NFC no Arduino são simulados, mas a matemática de distância e a decisão local são reais.</w:t>
       </w:r>
     </w:p>
     <w:p>
@@ -1070,7 +1070,7 @@
           <w:color w:val="000000"/>
           <w:sz w:val="21"/>
         </w:rPr>
-        <w:t>Proximo trem usa a API publica ViaMobilidade nas estacoes cobertas; fora disso, o app mostra fallback honesto.</w:t>
+        <w:t>Próximo trem usa a API pública ViaMobilidade nas estações cobertas; fora disso, o app mostra fallback honesto.</w:t>
       </w:r>
     </w:p>
     <w:p>
@@ -1084,7 +1084,7 @@
           <w:color w:val="000000"/>
           <w:sz w:val="21"/>
         </w:rPr>
-        <w:t>A priorizacao urbana consulta Overpass/OpenStreetMap, usa GTFS SPTrans local e calcula distancia por Haversine.</w:t>
+        <w:t>A priorização urbana consulta Overpass/OpenStreetMap, usa GTFS SPTrans local e calcula distância por Haversine.</w:t>
       </w:r>
     </w:p>
     <w:p>
@@ -1098,7 +1098,7 @@
           <w:color w:val="000000"/>
           <w:sz w:val="21"/>
         </w:rPr>
-        <w:t>Uma versao de producao exigiria dados oficiais, homologacao de pagamento e seguranca embarcada.</w:t>
+        <w:t>Uma versão de produção exigiria dados oficiais, homologação de pagamento e segurança embarcada.</w:t>
       </w:r>
     </w:p>
     <w:p>
@@ -1181,7 +1181,7 @@
                 <w:color w:val="1F4D78"/>
                 <w:sz w:val="19"/>
               </w:rPr>
-              <w:t>Conexao com o HoloPass</w:t>
+              <w:t>Conexão com o HoloPass</w:t>
             </w:r>
           </w:p>
         </w:tc>
@@ -1208,7 +1208,7 @@
                 <w:color w:val="1F4D78"/>
                 <w:sz w:val="19"/>
               </w:rPr>
-              <w:t>Beneficio esperado</w:t>
+              <w:t>Benefício esperado</w:t>
             </w:r>
           </w:p>
         </w:tc>
@@ -1248,7 +1248,7 @@
                 <w:color w:val="000000"/>
                 <w:sz w:val="18"/>
               </w:rPr>
-              <w:t>Software, dispositivo fisico e dados de localizacao</w:t>
+              <w:t>Software, dispositivo físico e dados de localização</w:t>
             </w:r>
           </w:p>
         </w:tc>
@@ -1307,7 +1307,7 @@
                 <w:color w:val="000000"/>
                 <w:sz w:val="18"/>
               </w:rPr>
-              <w:t>Menor dependencia de smartphone/dados moveis</w:t>
+              <w:t>Menor dependência de smartphone/dados móveis</w:t>
             </w:r>
           </w:p>
         </w:tc>
@@ -1366,7 +1366,7 @@
                 <w:color w:val="000000"/>
                 <w:sz w:val="18"/>
               </w:rPr>
-              <w:t>Rotas, baldeacoes e areas mal atendidas</w:t>
+              <w:t>Rotas, baldeações e áreas mal atendidas</w:t>
             </w:r>
           </w:p>
         </w:tc>
@@ -1385,7 +1385,7 @@
                 <w:color w:val="000000"/>
                 <w:sz w:val="18"/>
               </w:rPr>
-              <w:t>Cidades mais conectadas e previsiveis</w:t>
+              <w:t>Cidades mais conectadas e previsíveis</w:t>
             </w:r>
           </w:p>
         </w:tc>
@@ -1463,7 +1463,7 @@
           <w:color w:val="2E74B5"/>
           <w:sz w:val="32"/>
         </w:rPr>
-        <w:t>8. Declaracao da Visao do Produto</w:t>
+        <w:t>8. Declaração da Visão do Produto</w:t>
       </w:r>
     </w:p>
     <w:p>
@@ -1476,7 +1476,7 @@
           <w:color w:val="000000"/>
           <w:sz w:val="22"/>
         </w:rPr>
-        <w:t>Para passageiros urbanos que precisam viajar com seguranca, previsibilidade e menos dependencia do celular, o HoloPass e uma pulseira de transporte inteligente que combina pagamento NFC, localizacao GNSS, rota operacional e alertas fisicos. Diferente de um bilhete comum, ele integra pagamento, posicao, historico e planejamento urbano em uma experiencia unica e acessivel.</w:t>
+        <w:t>Para passageiros urbanos que precisam viajar com segurança, previsibilidade e menos dependência do celular, o HoloPass é uma pulseira de transporte inteligente que combina pagamento NFC, localização GNSS, rota operacional e alertas físicos. Diferente de um bilhete comum, ele integra pagamento, posição, histórico e planejamento urbano em uma experiência única e acessível.</w:t>
       </w:r>
     </w:p>
     <w:p>
@@ -1560,7 +1560,7 @@
                 <w:color w:val="1F4D78"/>
                 <w:sz w:val="19"/>
               </w:rPr>
-              <w:t>Historia de usuario</w:t>
+              <w:t>História de usuário</w:t>
             </w:r>
           </w:p>
         </w:tc>
@@ -1614,7 +1614,7 @@
                 <w:color w:val="1F4D78"/>
                 <w:sz w:val="19"/>
               </w:rPr>
-              <w:t>Criterio de aceite</w:t>
+              <w:t>Critério de aceite</w:t>
             </w:r>
           </w:p>
         </w:tc>
@@ -1654,7 +1654,7 @@
                 <w:color w:val="000000"/>
                 <w:sz w:val="18"/>
               </w:rPr>
-              <w:t>Pagar por NFC na catraca sem tirar celular/cartao do bolso.</w:t>
+              <w:t>Pagar por NFC na catraca sem tirar celular/cartão do bolso.</w:t>
             </w:r>
           </w:p>
         </w:tc>
@@ -1692,7 +1692,7 @@
                 <w:color w:val="000000"/>
                 <w:sz w:val="18"/>
               </w:rPr>
-              <w:t>Pagamento debita saldo e registra historico.</w:t>
+              <w:t>Pagamento debita saldo e registra histórico.</w:t>
             </w:r>
           </w:p>
         </w:tc>
@@ -1732,7 +1732,7 @@
                 <w:color w:val="000000"/>
                 <w:sz w:val="18"/>
               </w:rPr>
-              <w:t>Recarregar por PIX, cartao ou debito.</w:t>
+              <w:t>Recarregar por PIX, cartão ou débito.</w:t>
             </w:r>
           </w:p>
         </w:tc>
@@ -1770,7 +1770,7 @@
                 <w:color w:val="000000"/>
                 <w:sz w:val="18"/>
               </w:rPr>
-              <w:t>Valores R$20/50/100 atualizam saldo.</w:t>
+              <w:t>Valores de R$ 20, R$ 50 ou R$ 100 atualizam saldo.</w:t>
             </w:r>
           </w:p>
         </w:tc>
@@ -1810,7 +1810,7 @@
                 <w:color w:val="000000"/>
                 <w:sz w:val="18"/>
               </w:rPr>
-              <w:t>Detectar estacao por GNSS.</w:t>
+              <w:t>Detectar estação por GNSS.</w:t>
             </w:r>
           </w:p>
         </w:tc>
@@ -1848,7 +1848,7 @@
                 <w:color w:val="000000"/>
                 <w:sz w:val="18"/>
               </w:rPr>
-              <w:t>App mostra estacao mais proxima e precisao.</w:t>
+              <w:t>App mostra estação mais próxima e precisão.</w:t>
             </w:r>
           </w:p>
         </w:tc>
@@ -1888,7 +1888,7 @@
                 <w:color w:val="000000"/>
                 <w:sz w:val="18"/>
               </w:rPr>
-              <w:t>Calcular rota com baldeacoes reais.</w:t>
+              <w:t>Calcular rota com baldeações reais.</w:t>
             </w:r>
           </w:p>
         </w:tc>
@@ -1966,7 +1966,7 @@
                 <w:color w:val="000000"/>
                 <w:sz w:val="18"/>
               </w:rPr>
-              <w:t>Consultar saldo, historico e estatisticas.</w:t>
+              <w:t>Consultar saldo, histórico e estatísticas.</w:t>
             </w:r>
           </w:p>
         </w:tc>
@@ -1985,7 +1985,7 @@
                 <w:color w:val="000000"/>
                 <w:sz w:val="18"/>
               </w:rPr>
-              <w:t>Media</w:t>
+              <w:t>Média</w:t>
             </w:r>
           </w:p>
         </w:tc>
@@ -2004,7 +2004,7 @@
                 <w:color w:val="000000"/>
                 <w:sz w:val="18"/>
               </w:rPr>
-              <w:t>Painel atualiza apos recarga/pagamento.</w:t>
+              <w:t>Painel atualiza após recarga/pagamento.</w:t>
             </w:r>
           </w:p>
         </w:tc>
@@ -2063,7 +2063,7 @@
                 <w:color w:val="000000"/>
                 <w:sz w:val="18"/>
               </w:rPr>
-              <w:t>Media</w:t>
+              <w:t>Média</w:t>
             </w:r>
           </w:p>
         </w:tc>
@@ -2082,7 +2082,7 @@
                 <w:color w:val="000000"/>
                 <w:sz w:val="18"/>
               </w:rPr>
-              <w:t>Service worker mantem app aberto sem rede.</w:t>
+              <w:t>Service worker mantém app aberto sem rede.</w:t>
             </w:r>
           </w:p>
         </w:tc>
@@ -2122,7 +2122,7 @@
                 <w:color w:val="000000"/>
                 <w:sz w:val="18"/>
               </w:rPr>
-              <w:t>Visualizar areas mal atendidas.</w:t>
+              <w:t>Visualizar áreas mal atendidas.</w:t>
             </w:r>
           </w:p>
         </w:tc>
@@ -2141,7 +2141,7 @@
                 <w:color w:val="000000"/>
                 <w:sz w:val="18"/>
               </w:rPr>
-              <w:t>Media</w:t>
+              <w:t>Média</w:t>
             </w:r>
           </w:p>
         </w:tc>
@@ -2160,7 +2160,7 @@
                 <w:color w:val="000000"/>
                 <w:sz w:val="18"/>
               </w:rPr>
-              <w:t>GNSS/OSM mostram estacao proxima, distancia e prioridade.</w:t>
+              <w:t>GNSS/OSM mostram estação próxima, distância e prioridade.</w:t>
             </w:r>
           </w:p>
         </w:tc>
@@ -2200,7 +2200,7 @@
                 <w:color w:val="000000"/>
                 <w:sz w:val="18"/>
               </w:rPr>
-              <w:t>Receber recomendacao HoloRoute explicavel.</w:t>
+              <w:t>Receber recomendação HoloRoute explicável.</w:t>
             </w:r>
           </w:p>
         </w:tc>
@@ -2219,7 +2219,7 @@
                 <w:color w:val="000000"/>
                 <w:sz w:val="18"/>
               </w:rPr>
-              <w:t>Media</w:t>
+              <w:t>Média</w:t>
             </w:r>
           </w:p>
         </w:tc>
@@ -2238,7 +2238,7 @@
                 <w:color w:val="000000"/>
                 <w:sz w:val="18"/>
               </w:rPr>
-              <w:t>Painel mostra risco, lotacao e recomendacao deterministica.</w:t>
+              <w:t>Painel mostra risco, lotação e recomendação determinística.</w:t>
             </w:r>
           </w:p>
         </w:tc>
@@ -2278,7 +2278,7 @@
                 <w:color w:val="000000"/>
                 <w:sz w:val="18"/>
               </w:rPr>
-              <w:t>Ver evidencias tecnicas da entrega.</w:t>
+              <w:t>Ver evidências técnicas da entrega.</w:t>
             </w:r>
           </w:p>
         </w:tc>
@@ -2316,7 +2316,7 @@
                 <w:color w:val="000000"/>
                 <w:sz w:val="18"/>
               </w:rPr>
-              <w:t>Relatorio lista comando, resultado e pendencias.</w:t>
+              <w:t>Relatório lista comando, resultado e pendências.</w:t>
             </w:r>
           </w:p>
         </w:tc>
@@ -2348,7 +2348,7 @@
           <w:color w:val="000000"/>
           <w:sz w:val="22"/>
         </w:rPr>
-        <w:t>O fluxo usa pecas fundamentais de fluxograma: terminal para inicio/fim, retangulo para processo, losango para decisao, paralelogramo para entrada/saida e cilindro para dados persistidos.</w:t>
+        <w:t>O fluxo usa peças fundamentais de fluxograma: terminal para início/fim, retângulo para processo, losango para decisão, paralelogramo para entrada/saída e cilindro para dados persistidos.</w:t>
       </w:r>
     </w:p>
     <w:p>
@@ -2401,7 +2401,7 @@
           <w:color w:val="5B6770"/>
           <w:sz w:val="18"/>
         </w:rPr>
-        <w:t>Fluxograma do User Flow com simbolos padrao de processo, decisao, entrada/saida e dados.</w:t>
+        <w:t>Fluxograma do User Flow com símbolos padrão de processo, decisão, entrada/saída e dados.</w:t>
       </w:r>
     </w:p>
     <w:tbl>
@@ -2469,7 +2469,7 @@
                 <w:color w:val="1F4D78"/>
                 <w:sz w:val="19"/>
               </w:rPr>
-              <w:t>Peca</w:t>
+              <w:t>Peça</w:t>
             </w:r>
           </w:p>
         </w:tc>
@@ -2496,7 +2496,7 @@
                 <w:color w:val="1F4D78"/>
                 <w:sz w:val="19"/>
               </w:rPr>
-              <w:t>Acao do usuario/sistema</w:t>
+              <w:t>Ação do usuário/sistema</w:t>
             </w:r>
           </w:p>
         </w:tc>
@@ -2595,7 +2595,7 @@
                 <w:color w:val="000000"/>
                 <w:sz w:val="18"/>
               </w:rPr>
-              <w:t>Decisao</w:t>
+              <w:t>Decisão</w:t>
             </w:r>
           </w:p>
         </w:tc>
@@ -2614,7 +2614,7 @@
                 <w:color w:val="000000"/>
                 <w:sz w:val="18"/>
               </w:rPr>
-              <w:t>Sistema verifica se existe sessao ativa.</w:t>
+              <w:t>Sistema verifica se existe sessão ativa.</w:t>
             </w:r>
           </w:p>
         </w:tc>
@@ -2673,7 +2673,7 @@
                 <w:color w:val="000000"/>
                 <w:sz w:val="18"/>
               </w:rPr>
-              <w:t>Usuario faz login, cadastro ou entra no modo demo.</w:t>
+              <w:t>Usuário faz login, cadastro ou entra no modo demo.</w:t>
             </w:r>
           </w:p>
         </w:tc>
@@ -2732,7 +2732,7 @@
                 <w:color w:val="000000"/>
                 <w:sz w:val="18"/>
               </w:rPr>
-              <w:t>Sistema carrega saldo, historico e cache local.</w:t>
+              <w:t>Sistema carrega saldo, histórico e cache local.</w:t>
             </w:r>
           </w:p>
         </w:tc>
@@ -2772,7 +2772,7 @@
                 <w:color w:val="000000"/>
                 <w:sz w:val="18"/>
               </w:rPr>
-              <w:t>Decisao</w:t>
+              <w:t>Decisão</w:t>
             </w:r>
           </w:p>
         </w:tc>
@@ -2850,7 +2850,7 @@
                 <w:color w:val="000000"/>
                 <w:sz w:val="18"/>
               </w:rPr>
-              <w:t>Se necessario, usuario recarrega por PIX, cartao ou debito.</w:t>
+              <w:t>Se necessário, usuário recarrega por PIX, cartão ou débito.</w:t>
             </w:r>
           </w:p>
         </w:tc>
@@ -2890,7 +2890,7 @@
                 <w:color w:val="000000"/>
                 <w:sz w:val="18"/>
               </w:rPr>
-              <w:t>Entrada/Saida</w:t>
+              <w:t>Entrada/Saída</w:t>
             </w:r>
           </w:p>
         </w:tc>
@@ -2909,7 +2909,7 @@
                 <w:color w:val="000000"/>
                 <w:sz w:val="18"/>
               </w:rPr>
-              <w:t>Usuario informa origem por GNSS/manual e seleciona destino.</w:t>
+              <w:t>Usuário informa origem por GNSS/manual e seleciona destino.</w:t>
             </w:r>
           </w:p>
         </w:tc>
@@ -2968,7 +2968,7 @@
                 <w:color w:val="000000"/>
                 <w:sz w:val="18"/>
               </w:rPr>
-              <w:t>HoloRoute calcula grafo, linhas, paradas e baldeacoes.</w:t>
+              <w:t>HoloRoute calcula grafo, linhas, paradas e baldeações.</w:t>
             </w:r>
           </w:p>
         </w:tc>
@@ -3008,7 +3008,7 @@
                 <w:color w:val="000000"/>
                 <w:sz w:val="18"/>
               </w:rPr>
-              <w:t>Entrada/Saida</w:t>
+              <w:t>Entrada/Saída</w:t>
             </w:r>
           </w:p>
         </w:tc>
@@ -3027,7 +3027,7 @@
                 <w:color w:val="000000"/>
                 <w:sz w:val="18"/>
               </w:rPr>
-              <w:t>App exibe rota visual, tempo, tarifa e recomendacao.</w:t>
+              <w:t>App exibe rota visual, tempo, tarifa e recomendação.</w:t>
             </w:r>
           </w:p>
         </w:tc>
@@ -3086,7 +3086,7 @@
                 <w:color w:val="000000"/>
                 <w:sz w:val="18"/>
               </w:rPr>
-              <w:t>Usuario aproxima NFC; sistema debita ou bloqueia por saldo insuficiente.</w:t>
+              <w:t>Usuário aproxima NFC; sistema debita ou bloqueia por saldo insuficiente.</w:t>
             </w:r>
           </w:p>
         </w:tc>
@@ -3145,7 +3145,7 @@
                 <w:color w:val="000000"/>
                 <w:sz w:val="18"/>
               </w:rPr>
-              <w:t>Historico e PWA sao atualizados; embarque fica registrado.</w:t>
+              <w:t>Histórico e PWA são atualizados; embarque fica registrado.</w:t>
             </w:r>
           </w:p>
         </w:tc>
@@ -3164,7 +3164,7 @@
           <w:color w:val="2E74B5"/>
           <w:sz w:val="32"/>
         </w:rPr>
-        <w:t>11. Criterios de Aceite</w:t>
+        <w:t>11. Critérios de Aceite</w:t>
       </w:r>
     </w:p>
     <w:p>
@@ -3206,7 +3206,7 @@
           <w:color w:val="000000"/>
           <w:sz w:val="21"/>
         </w:rPr>
-        <w:t>Distancia exibida e rotulada como operacional estimada por trechos da rede.</w:t>
+        <w:t>Distância exibida e rotulada como operacional estimada por trechos da rede.</w:t>
       </w:r>
     </w:p>
     <w:p>
@@ -3220,7 +3220,7 @@
           <w:color w:val="000000"/>
           <w:sz w:val="21"/>
         </w:rPr>
-        <w:t>Nenhuma promessa tecnica sem evidencia ou API real nao comprovada.</w:t>
+        <w:t>Nenhuma promessa técnica sem evidência ou API real não comprovada.</w:t>
       </w:r>
     </w:p>
     <w:p>
@@ -3248,7 +3248,7 @@
           <w:color w:val="000000"/>
           <w:sz w:val="21"/>
         </w:rPr>
-        <w:t>CT Python usa conceitos obrigatorios e nao depende de pacote externo.</w:t>
+        <w:t>CT Python usa conceitos obrigatórios e não depende de pacote externo.</w:t>
       </w:r>
     </w:p>
     <w:p>
@@ -3276,7 +3276,7 @@
           <w:color w:val="000000"/>
           <w:sz w:val="21"/>
         </w:rPr>
-        <w:t>Pendencias externas ficam separadas: video, Wokwi publico e organizacao GitHub.</w:t>
+        <w:t>Pendências externas ficam separadas: vídeo, Wokwi público e organização GitHub.</w:t>
       </w:r>
     </w:p>
     <w:sectPr>

</xml_diff>